<commit_message>
Portale: il modulo asseverazione da scaricare è quello del 15/09
Il file scaricabile dalla pagina Asseverazione era ancora il modello
5.D.1 in uso fino al 14/09/2026 (identico byte per byte alla copia
conservata come «_in-uso-fino-al-2026-09-14.docx»). Sostituito con
l'attuale «MOD_CNCPT_5D1-richiesta-di-verifica.docx» del vault, che
fa dichiarare all'impresa «di aver consultato il Rappresentante dei
Lavoratori (RLS/RLST)» e scrive «(DURC da allegare)» accanto alla
regolarità contributiva — gli stessi due punti che l'avviso di
scadenza dell'app asseverazione allega dal 15/09.

Il service worker non mette in cache il .docx e per i file che non
sono immagini va sempre in rete prima: la sostituzione si vede
appena pubblicata.

Co-Authored-By: Claude Opus 5 <noreply@anthropic.com>
</commit_message>
<xml_diff>
--- a/Modulo_Richiesta_Asseverazione.docx
+++ b/Modulo_Richiesta_Asseverazione.docx
@@ -1,6 +1,6 @@
 
 <file path=word/document.xml><?xml version="1.0" encoding="utf-8"?>
-<w:document xmlns:wpc="http://schemas.microsoft.com/office/word/2010/wordprocessingCanvas" xmlns:cx="http://schemas.microsoft.com/office/drawing/2014/chartex" xmlns:cx1="http://schemas.microsoft.com/office/drawing/2015/9/8/chartex" xmlns:cx2="http://schemas.microsoft.com/office/drawing/2015/10/21/chartex" xmlns:cx3="http://schemas.microsoft.com/office/drawing/2016/5/9/chartex" xmlns:cx4="http://schemas.microsoft.com/office/drawing/2016/5/10/chartex" xmlns:cx5="http://schemas.microsoft.com/office/drawing/2016/5/11/chartex" xmlns:cx6="http://schemas.microsoft.com/office/drawing/2016/5/12/chartex" xmlns:cx7="http://schemas.microsoft.com/office/drawing/2016/5/13/chartex" xmlns:cx8="http://schemas.microsoft.com/office/drawing/2016/5/14/chartex" xmlns:mc="http://schemas.openxmlformats.org/markup-compatibility/2006" xmlns:aink="http://schemas.microsoft.com/office/drawing/2016/ink" xmlns:am3d="http://schemas.microsoft.com/office/drawing/2017/model3d" xmlns:o="urn:schemas-microsoft-com:office:office" xmlns:oel="http://schemas.microsoft.com/office/2019/extlst" xmlns:r="http://schemas.openxmlformats.org/officeDocument/2006/relationships" xmlns:m="http://schemas.openxmlformats.org/officeDocument/2006/math" xmlns:v="urn:schemas-microsoft-com:vml" xmlns:wp14="http://schemas.microsoft.com/office/word/2010/wordprocessingDrawing" xmlns:wp="http://schemas.openxmlformats.org/drawingml/2006/wordprocessingDrawing" xmlns:w10="urn:schemas-microsoft-com:office:word" xmlns:w="http://schemas.openxmlformats.org/wordprocessingml/2006/main" xmlns:w14="http://schemas.microsoft.com/office/word/2010/wordml" xmlns:w15="http://schemas.microsoft.com/office/word/2012/wordml" xmlns:w16cex="http://schemas.microsoft.com/office/word/2018/wordml/cex" xmlns:w16cid="http://schemas.microsoft.com/office/word/2016/wordml/cid" xmlns:w16="http://schemas.microsoft.com/office/word/2018/wordml" xmlns:w16du="http://schemas.microsoft.com/office/word/2023/wordml/word16du" xmlns:w16sdtdh="http://schemas.microsoft.com/office/word/2020/wordml/sdtdatahash" xmlns:w16sdtfl="http://schemas.microsoft.com/office/word/2024/wordml/sdtformatlock" xmlns:w16se="http://schemas.microsoft.com/office/word/2015/wordml/symex" xmlns:wpg="http://schemas.microsoft.com/office/word/2010/wordprocessingGroup" xmlns:wpi="http://schemas.microsoft.com/office/word/2010/wordprocessingInk" xmlns:wne="http://schemas.microsoft.com/office/word/2006/wordml" xmlns:wps="http://schemas.microsoft.com/office/word/2010/wordprocessingShape" mc:Ignorable="w14 w15 w16se w16cid w16 w16cex w16sdtdh w16sdtfl w16du wp14">
+<w:document xmlns:wpc="http://schemas.microsoft.com/office/word/2010/wordprocessingCanvas" xmlns:cx="http://schemas.microsoft.com/office/drawing/2014/chartex" xmlns:cx1="http://schemas.microsoft.com/office/drawing/2015/9/8/chartex" xmlns:cx2="http://schemas.microsoft.com/office/drawing/2015/10/21/chartex" xmlns:cx3="http://schemas.microsoft.com/office/drawing/2016/5/9/chartex" xmlns:cx4="http://schemas.microsoft.com/office/drawing/2016/5/10/chartex" xmlns:cx5="http://schemas.microsoft.com/office/drawing/2016/5/11/chartex" xmlns:cx6="http://schemas.microsoft.com/office/drawing/2016/5/12/chartex" xmlns:cx7="http://schemas.microsoft.com/office/drawing/2016/5/13/chartex" xmlns:cx8="http://schemas.microsoft.com/office/drawing/2016/5/14/chartex" xmlns:mc="http://schemas.openxmlformats.org/markup-compatibility/2006" xmlns:aink="http://schemas.microsoft.com/office/drawing/2016/ink" xmlns:am3d="http://schemas.microsoft.com/office/drawing/2017/model3d" xmlns:o="urn:schemas-microsoft-com:office:office" xmlns:oel="http://schemas.microsoft.com/office/2019/extlst" xmlns:r="http://schemas.openxmlformats.org/officeDocument/2006/relationships" xmlns:m="http://schemas.openxmlformats.org/officeDocument/2006/math" xmlns:v="urn:schemas-microsoft-com:vml" xmlns:wp14="http://schemas.microsoft.com/office/word/2010/wordprocessingDrawing" xmlns:wp="http://schemas.openxmlformats.org/drawingml/2006/wordprocessingDrawing" xmlns:w10="urn:schemas-microsoft-com:office:word" xmlns:w="http://schemas.openxmlformats.org/wordprocessingml/2006/main" xmlns:w14="http://schemas.microsoft.com/office/word/2010/wordml" xmlns:w15="http://schemas.microsoft.com/office/word/2012/wordml" xmlns:w16cex="http://schemas.microsoft.com/office/word/2018/wordml/cex" xmlns:w16cid="http://schemas.microsoft.com/office/word/2016/wordml/cid" xmlns:w16="http://schemas.microsoft.com/office/word/2018/wordml" xmlns:w16sdtdh="http://schemas.microsoft.com/office/word/2020/wordml/sdtdatahash" xmlns:w16se="http://schemas.microsoft.com/office/word/2015/wordml/symex" xmlns:wpg="http://schemas.microsoft.com/office/word/2010/wordprocessingGroup" xmlns:wpi="http://schemas.microsoft.com/office/word/2010/wordprocessingInk" xmlns:wne="http://schemas.microsoft.com/office/word/2006/wordml" xmlns:wps="http://schemas.microsoft.com/office/word/2010/wordprocessingShape" mc:Ignorable="w14 w15 w16se w16cid w16 w16cex w16sdtdh wp14">
   <w:body>
     <w:p>
       <w:pPr>
@@ -218,7 +218,28 @@
           <w:rFonts w:ascii="Barlow" w:hAnsi="Barlow"/>
           <w:lang w:eastAsia="fr-FR"/>
         </w:rPr>
-        <w:t>…………………</w:t>
+        <w:t xml:space="preserve">……………………….……..., </w:t>
+      </w:r>
+      <w:r>
+        <w:rPr>
+          <w:rFonts w:ascii="Barlow" w:hAnsi="Barlow"/>
+          <w:lang w:eastAsia="fr-FR"/>
+        </w:rPr>
+        <w:t>con sed</w:t>
+      </w:r>
+      <w:r>
+        <w:rPr>
+          <w:rFonts w:ascii="Barlow" w:hAnsi="Barlow"/>
+          <w:lang w:eastAsia="fr-FR"/>
+        </w:rPr>
+        <w:t>e in ………………………………. Via …………………</w:t>
+      </w:r>
+      <w:r>
+        <w:rPr>
+          <w:rFonts w:ascii="Barlow" w:hAnsi="Barlow"/>
+          <w:lang w:eastAsia="fr-FR"/>
+        </w:rPr>
+        <w:t>…………………… n</w:t>
       </w:r>
       <w:proofErr w:type="gramStart"/>
       <w:r>
@@ -234,28 +255,7 @@
           <w:rFonts w:ascii="Barlow" w:hAnsi="Barlow"/>
           <w:lang w:eastAsia="fr-FR"/>
         </w:rPr>
-        <w:t xml:space="preserve">……..., </w:t>
-      </w:r>
-      <w:r>
-        <w:rPr>
-          <w:rFonts w:ascii="Barlow" w:hAnsi="Barlow"/>
-          <w:lang w:eastAsia="fr-FR"/>
-        </w:rPr>
-        <w:t>con sed</w:t>
-      </w:r>
-      <w:r>
-        <w:rPr>
-          <w:rFonts w:ascii="Barlow" w:hAnsi="Barlow"/>
-          <w:lang w:eastAsia="fr-FR"/>
-        </w:rPr>
-        <w:t>e in ………………………………. Via …………………</w:t>
-      </w:r>
-      <w:r>
-        <w:rPr>
-          <w:rFonts w:ascii="Barlow" w:hAnsi="Barlow"/>
-          <w:lang w:eastAsia="fr-FR"/>
-        </w:rPr>
-        <w:t>…………………… n</w:t>
+        <w:t>., Tel. ………………….. Fax……………</w:t>
       </w:r>
       <w:proofErr w:type="gramStart"/>
       <w:r>
@@ -271,7 +271,35 @@
           <w:rFonts w:ascii="Barlow" w:hAnsi="Barlow"/>
           <w:lang w:eastAsia="fr-FR"/>
         </w:rPr>
-        <w:t>., Tel. ……………</w:t>
+        <w:t xml:space="preserve">. Partita IVA …………………………………. iscritta presso la Cassa Edile di </w:t>
+      </w:r>
+      <w:r>
+        <w:rPr>
+          <w:rFonts w:ascii="Barlow" w:hAnsi="Barlow"/>
+          <w:lang w:eastAsia="fr-FR"/>
+        </w:rPr>
+        <w:t>Padova con</w:t>
+      </w:r>
+      <w:r>
+        <w:rPr>
+          <w:rFonts w:ascii="Barlow" w:hAnsi="Barlow"/>
+          <w:lang w:eastAsia="fr-FR"/>
+        </w:rPr>
+        <w:t xml:space="preserve"> </w:t>
+      </w:r>
+      <w:r>
+        <w:rPr>
+          <w:rFonts w:ascii="Barlow" w:hAnsi="Barlow"/>
+          <w:lang w:eastAsia="fr-FR"/>
+        </w:rPr>
+        <w:t>C</w:t>
+      </w:r>
+      <w:r>
+        <w:rPr>
+          <w:rFonts w:ascii="Barlow" w:hAnsi="Barlow"/>
+          <w:lang w:eastAsia="fr-FR"/>
+        </w:rPr>
+        <w:t>odice ………</w:t>
       </w:r>
       <w:proofErr w:type="gramStart"/>
       <w:r>
@@ -287,7 +315,139 @@
           <w:rFonts w:ascii="Barlow" w:hAnsi="Barlow"/>
           <w:lang w:eastAsia="fr-FR"/>
         </w:rPr>
-        <w:t>. Fax……………</w:t>
+        <w:t>.</w:t>
+      </w:r>
+      <w:r>
+        <w:rPr>
+          <w:rFonts w:ascii="Barlow" w:hAnsi="Barlow"/>
+          <w:lang w:eastAsia="fr-FR"/>
+        </w:rPr>
+        <w:t xml:space="preserve"> </w:t>
+      </w:r>
+      <w:r>
+        <w:rPr>
+          <w:rFonts w:ascii="Barlow" w:hAnsi="Barlow"/>
+          <w:lang w:eastAsia="fr-FR"/>
+        </w:rPr>
+        <w:t xml:space="preserve">Cod. </w:t>
+      </w:r>
+      <w:r>
+        <w:rPr>
+          <w:rFonts w:ascii="Barlow" w:hAnsi="Barlow"/>
+          <w:lang w:eastAsia="fr-FR"/>
+        </w:rPr>
+        <w:t>ATECO……….</w:t>
+      </w:r>
+    </w:p>
+    <w:p>
+      <w:pPr>
+        <w:rPr>
+          <w:rFonts w:ascii="Barlow" w:hAnsi="Barlow"/>
+          <w:lang w:eastAsia="fr-FR"/>
+        </w:rPr>
+      </w:pPr>
+    </w:p>
+    <w:p>
+      <w:pPr>
+        <w:jc w:val="left"/>
+        <w:rPr>
+          <w:rFonts w:ascii="Barlow" w:hAnsi="Barlow"/>
+          <w:lang w:eastAsia="fr-FR"/>
+        </w:rPr>
+      </w:pPr>
+      <w:r>
+        <w:rPr>
+          <w:rFonts w:ascii="Times New Roman" w:hAnsi="Times New Roman" w:cs="Times New Roman"/>
+          <w:lang w:eastAsia="fr-FR"/>
+        </w:rPr>
+        <w:t>□</w:t>
+      </w:r>
+      <w:r>
+        <w:rPr>
+          <w:rFonts w:ascii="Barlow" w:hAnsi="Barlow"/>
+          <w:lang w:eastAsia="fr-FR"/>
+        </w:rPr>
+        <w:t xml:space="preserve"> </w:t>
+      </w:r>
+      <w:r>
+        <w:rPr>
+          <w:rFonts w:ascii="Barlow" w:hAnsi="Barlow"/>
+          <w:lang w:eastAsia="fr-FR"/>
+        </w:rPr>
+        <w:t>ha un Sistema Qualità UNI EN ISO 9001 certificato</w:t>
+      </w:r>
+    </w:p>
+    <w:p>
+      <w:pPr>
+        <w:jc w:val="left"/>
+        <w:rPr>
+          <w:rFonts w:ascii="Barlow" w:hAnsi="Barlow"/>
+          <w:lang w:eastAsia="fr-FR"/>
+        </w:rPr>
+      </w:pPr>
+      <w:r>
+        <w:rPr>
+          <w:rFonts w:ascii="Times New Roman" w:hAnsi="Times New Roman" w:cs="Times New Roman"/>
+          <w:lang w:eastAsia="fr-FR"/>
+        </w:rPr>
+        <w:t>□</w:t>
+      </w:r>
+      <w:r>
+        <w:rPr>
+          <w:rFonts w:ascii="Barlow" w:hAnsi="Barlow"/>
+          <w:lang w:eastAsia="fr-FR"/>
+        </w:rPr>
+        <w:t xml:space="preserve"> non ha un Sistema Qualità UNI EN ISO 9001 certificato</w:t>
+      </w:r>
+    </w:p>
+    <w:p>
+      <w:pPr>
+        <w:rPr>
+          <w:rFonts w:ascii="Barlow" w:hAnsi="Barlow"/>
+          <w:lang w:eastAsia="fr-FR"/>
+        </w:rPr>
+      </w:pPr>
+    </w:p>
+    <w:p>
+      <w:pPr>
+        <w:jc w:val="center"/>
+        <w:rPr>
+          <w:rFonts w:ascii="Barlow" w:hAnsi="Barlow"/>
+          <w:b/>
+          <w:lang w:eastAsia="fr-FR"/>
+        </w:rPr>
+      </w:pPr>
+      <w:r>
+        <w:rPr>
+          <w:rFonts w:ascii="Barlow" w:hAnsi="Barlow"/>
+          <w:b/>
+          <w:lang w:eastAsia="fr-FR"/>
+        </w:rPr>
+        <w:t>DICHIARA CHE LA PROPRIA IMPRESA HA</w:t>
+      </w:r>
+    </w:p>
+    <w:p>
+      <w:pPr>
+        <w:rPr>
+          <w:rFonts w:ascii="Barlow" w:hAnsi="Barlow"/>
+          <w:b/>
+          <w:lang w:eastAsia="fr-FR"/>
+        </w:rPr>
+      </w:pPr>
+    </w:p>
+    <w:p>
+      <w:pPr>
+        <w:rPr>
+          <w:rFonts w:ascii="Barlow" w:hAnsi="Barlow"/>
+          <w:lang w:eastAsia="fr-FR"/>
+        </w:rPr>
+      </w:pPr>
+      <w:r>
+        <w:rPr>
+          <w:rFonts w:ascii="Barlow" w:hAnsi="Barlow"/>
+          <w:lang w:eastAsia="fr-FR"/>
+        </w:rPr>
+        <w:t>N……………</w:t>
       </w:r>
       <w:proofErr w:type="gramStart"/>
       <w:r>
@@ -295,6 +455,38 @@
           <w:rFonts w:ascii="Barlow" w:hAnsi="Barlow"/>
           <w:lang w:eastAsia="fr-FR"/>
         </w:rPr>
+        <w:t>…....</w:t>
+      </w:r>
+      <w:proofErr w:type="gramEnd"/>
+      <w:r>
+        <w:rPr>
+          <w:rFonts w:ascii="Barlow" w:hAnsi="Barlow"/>
+          <w:lang w:eastAsia="fr-FR"/>
+        </w:rPr>
+        <w:t>dipendenti, di cui:</w:t>
+      </w:r>
+    </w:p>
+    <w:p>
+      <w:pPr>
+        <w:ind w:firstLine="3544"/>
+        <w:rPr>
+          <w:rFonts w:ascii="Barlow" w:hAnsi="Barlow"/>
+          <w:lang w:eastAsia="fr-FR"/>
+        </w:rPr>
+      </w:pPr>
+      <w:r>
+        <w:rPr>
+          <w:rFonts w:ascii="Barlow" w:hAnsi="Barlow"/>
+          <w:lang w:eastAsia="fr-FR"/>
+        </w:rPr>
+        <w:t>n……………</w:t>
+      </w:r>
+      <w:proofErr w:type="gramStart"/>
+      <w:r>
+        <w:rPr>
+          <w:rFonts w:ascii="Barlow" w:hAnsi="Barlow"/>
+          <w:lang w:eastAsia="fr-FR"/>
+        </w:rPr>
         <w:t>…….</w:t>
       </w:r>
       <w:proofErr w:type="gramEnd"/>
@@ -303,35 +495,23 @@
           <w:rFonts w:ascii="Barlow" w:hAnsi="Barlow"/>
           <w:lang w:eastAsia="fr-FR"/>
         </w:rPr>
-        <w:t xml:space="preserve">. Partita IVA …………………………………. iscritta presso la Cassa Edile di </w:t>
-      </w:r>
-      <w:r>
-        <w:rPr>
-          <w:rFonts w:ascii="Barlow" w:hAnsi="Barlow"/>
-          <w:lang w:eastAsia="fr-FR"/>
-        </w:rPr>
-        <w:t>Padova con</w:t>
-      </w:r>
-      <w:r>
-        <w:rPr>
-          <w:rFonts w:ascii="Barlow" w:hAnsi="Barlow"/>
-          <w:lang w:eastAsia="fr-FR"/>
-        </w:rPr>
-        <w:t xml:space="preserve"> </w:t>
-      </w:r>
-      <w:r>
-        <w:rPr>
-          <w:rFonts w:ascii="Barlow" w:hAnsi="Barlow"/>
-          <w:lang w:eastAsia="fr-FR"/>
-        </w:rPr>
-        <w:t>C</w:t>
-      </w:r>
-      <w:r>
-        <w:rPr>
-          <w:rFonts w:ascii="Barlow" w:hAnsi="Barlow"/>
-          <w:lang w:eastAsia="fr-FR"/>
-        </w:rPr>
-        <w:t>odice ………</w:t>
+        <w:t>dirigenti</w:t>
+      </w:r>
+    </w:p>
+    <w:p>
+      <w:pPr>
+        <w:ind w:firstLine="3544"/>
+        <w:rPr>
+          <w:rFonts w:ascii="Barlow" w:hAnsi="Barlow"/>
+          <w:lang w:eastAsia="fr-FR"/>
+        </w:rPr>
+      </w:pPr>
+      <w:r>
+        <w:rPr>
+          <w:rFonts w:ascii="Barlow" w:hAnsi="Barlow"/>
+          <w:lang w:eastAsia="fr-FR"/>
+        </w:rPr>
+        <w:t>n……………</w:t>
       </w:r>
       <w:proofErr w:type="gramStart"/>
       <w:r>
@@ -347,139 +527,23 @@
           <w:rFonts w:ascii="Barlow" w:hAnsi="Barlow"/>
           <w:lang w:eastAsia="fr-FR"/>
         </w:rPr>
-        <w:t>.</w:t>
-      </w:r>
-      <w:r>
-        <w:rPr>
-          <w:rFonts w:ascii="Barlow" w:hAnsi="Barlow"/>
-          <w:lang w:eastAsia="fr-FR"/>
-        </w:rPr>
-        <w:t xml:space="preserve"> </w:t>
-      </w:r>
-      <w:r>
-        <w:rPr>
-          <w:rFonts w:ascii="Barlow" w:hAnsi="Barlow"/>
-          <w:lang w:eastAsia="fr-FR"/>
-        </w:rPr>
-        <w:t xml:space="preserve">Cod. </w:t>
-      </w:r>
-      <w:r>
-        <w:rPr>
-          <w:rFonts w:ascii="Barlow" w:hAnsi="Barlow"/>
-          <w:lang w:eastAsia="fr-FR"/>
-        </w:rPr>
-        <w:t>ATECO……….</w:t>
-      </w:r>
-    </w:p>
-    <w:p>
-      <w:pPr>
-        <w:rPr>
-          <w:rFonts w:ascii="Barlow" w:hAnsi="Barlow"/>
-          <w:lang w:eastAsia="fr-FR"/>
-        </w:rPr>
-      </w:pPr>
-    </w:p>
-    <w:p>
-      <w:pPr>
-        <w:jc w:val="left"/>
-        <w:rPr>
-          <w:rFonts w:ascii="Barlow" w:hAnsi="Barlow"/>
-          <w:lang w:eastAsia="fr-FR"/>
-        </w:rPr>
-      </w:pPr>
-      <w:r>
-        <w:rPr>
-          <w:rFonts w:ascii="Times New Roman" w:hAnsi="Times New Roman" w:cs="Times New Roman"/>
-          <w:lang w:eastAsia="fr-FR"/>
-        </w:rPr>
-        <w:t>□</w:t>
-      </w:r>
-      <w:r>
-        <w:rPr>
-          <w:rFonts w:ascii="Barlow" w:hAnsi="Barlow"/>
-          <w:lang w:eastAsia="fr-FR"/>
-        </w:rPr>
-        <w:t xml:space="preserve"> </w:t>
-      </w:r>
-      <w:r>
-        <w:rPr>
-          <w:rFonts w:ascii="Barlow" w:hAnsi="Barlow"/>
-          <w:lang w:eastAsia="fr-FR"/>
-        </w:rPr>
-        <w:t>ha un Sistema Qualità UNI EN ISO 9001 certificato</w:t>
-      </w:r>
-    </w:p>
-    <w:p>
-      <w:pPr>
-        <w:jc w:val="left"/>
-        <w:rPr>
-          <w:rFonts w:ascii="Barlow" w:hAnsi="Barlow"/>
-          <w:lang w:eastAsia="fr-FR"/>
-        </w:rPr>
-      </w:pPr>
-      <w:r>
-        <w:rPr>
-          <w:rFonts w:ascii="Times New Roman" w:hAnsi="Times New Roman" w:cs="Times New Roman"/>
-          <w:lang w:eastAsia="fr-FR"/>
-        </w:rPr>
-        <w:t>□</w:t>
-      </w:r>
-      <w:r>
-        <w:rPr>
-          <w:rFonts w:ascii="Barlow" w:hAnsi="Barlow"/>
-          <w:lang w:eastAsia="fr-FR"/>
-        </w:rPr>
-        <w:t xml:space="preserve"> non ha un Sistema Qualità UNI EN ISO 9001 certificato</w:t>
-      </w:r>
-    </w:p>
-    <w:p>
-      <w:pPr>
-        <w:rPr>
-          <w:rFonts w:ascii="Barlow" w:hAnsi="Barlow"/>
-          <w:lang w:eastAsia="fr-FR"/>
-        </w:rPr>
-      </w:pPr>
-    </w:p>
-    <w:p>
-      <w:pPr>
-        <w:jc w:val="center"/>
-        <w:rPr>
-          <w:rFonts w:ascii="Barlow" w:hAnsi="Barlow"/>
-          <w:b/>
-          <w:lang w:eastAsia="fr-FR"/>
-        </w:rPr>
-      </w:pPr>
-      <w:r>
-        <w:rPr>
-          <w:rFonts w:ascii="Barlow" w:hAnsi="Barlow"/>
-          <w:b/>
-          <w:lang w:eastAsia="fr-FR"/>
-        </w:rPr>
-        <w:t>DICHIARA CHE LA PROPRIA IMPRESA HA</w:t>
-      </w:r>
-    </w:p>
-    <w:p>
-      <w:pPr>
-        <w:rPr>
-          <w:rFonts w:ascii="Barlow" w:hAnsi="Barlow"/>
-          <w:b/>
-          <w:lang w:eastAsia="fr-FR"/>
-        </w:rPr>
-      </w:pPr>
-    </w:p>
-    <w:p>
-      <w:pPr>
-        <w:rPr>
-          <w:rFonts w:ascii="Barlow" w:hAnsi="Barlow"/>
-          <w:lang w:eastAsia="fr-FR"/>
-        </w:rPr>
-      </w:pPr>
-      <w:r>
-        <w:rPr>
-          <w:rFonts w:ascii="Barlow" w:hAnsi="Barlow"/>
-          <w:lang w:eastAsia="fr-FR"/>
-        </w:rPr>
-        <w:t>N……………</w:t>
+        <w:t>impiegati tecnici</w:t>
+      </w:r>
+    </w:p>
+    <w:p>
+      <w:pPr>
+        <w:ind w:firstLine="3544"/>
+        <w:rPr>
+          <w:rFonts w:ascii="Barlow" w:hAnsi="Barlow"/>
+          <w:lang w:eastAsia="fr-FR"/>
+        </w:rPr>
+      </w:pPr>
+      <w:r>
+        <w:rPr>
+          <w:rFonts w:ascii="Barlow" w:hAnsi="Barlow"/>
+          <w:lang w:eastAsia="fr-FR"/>
+        </w:rPr>
+        <w:t>n……………</w:t>
       </w:r>
       <w:proofErr w:type="gramStart"/>
       <w:r>
@@ -487,7 +551,7 @@
           <w:rFonts w:ascii="Barlow" w:hAnsi="Barlow"/>
           <w:lang w:eastAsia="fr-FR"/>
         </w:rPr>
-        <w:t>…....</w:t>
+        <w:t>…….</w:t>
       </w:r>
       <w:proofErr w:type="gramEnd"/>
       <w:r>
@@ -495,7 +559,7 @@
           <w:rFonts w:ascii="Barlow" w:hAnsi="Barlow"/>
           <w:lang w:eastAsia="fr-FR"/>
         </w:rPr>
-        <w:t>dipendenti, di cui:</w:t>
+        <w:t>impiegati amministrativi</w:t>
       </w:r>
     </w:p>
     <w:p>
@@ -527,7 +591,7 @@
           <w:rFonts w:ascii="Barlow" w:hAnsi="Barlow"/>
           <w:lang w:eastAsia="fr-FR"/>
         </w:rPr>
-        <w:t>dirigenti</w:t>
+        <w:t>operai</w:t>
       </w:r>
     </w:p>
     <w:p>
@@ -559,119 +623,7 @@
           <w:rFonts w:ascii="Barlow" w:hAnsi="Barlow"/>
           <w:lang w:eastAsia="fr-FR"/>
         </w:rPr>
-        <w:t>impiegati tecnici</w:t>
-      </w:r>
-    </w:p>
-    <w:p>
-      <w:pPr>
-        <w:ind w:firstLine="3544"/>
-        <w:rPr>
-          <w:rFonts w:ascii="Barlow" w:hAnsi="Barlow"/>
-          <w:lang w:eastAsia="fr-FR"/>
-        </w:rPr>
-      </w:pPr>
-      <w:r>
-        <w:rPr>
-          <w:rFonts w:ascii="Barlow" w:hAnsi="Barlow"/>
-          <w:lang w:eastAsia="fr-FR"/>
-        </w:rPr>
-        <w:t>n……………</w:t>
-      </w:r>
-      <w:proofErr w:type="gramStart"/>
-      <w:r>
-        <w:rPr>
-          <w:rFonts w:ascii="Barlow" w:hAnsi="Barlow"/>
-          <w:lang w:eastAsia="fr-FR"/>
-        </w:rPr>
-        <w:t>…….</w:t>
-      </w:r>
-      <w:proofErr w:type="gramEnd"/>
-      <w:r>
-        <w:rPr>
-          <w:rFonts w:ascii="Barlow" w:hAnsi="Barlow"/>
-          <w:lang w:eastAsia="fr-FR"/>
-        </w:rPr>
-        <w:t>impiegati amministrativi</w:t>
-      </w:r>
-    </w:p>
-    <w:p>
-      <w:pPr>
-        <w:ind w:firstLine="3544"/>
-        <w:rPr>
-          <w:rFonts w:ascii="Barlow" w:hAnsi="Barlow"/>
-          <w:lang w:eastAsia="fr-FR"/>
-        </w:rPr>
-      </w:pPr>
-      <w:r>
-        <w:rPr>
-          <w:rFonts w:ascii="Barlow" w:hAnsi="Barlow"/>
-          <w:lang w:eastAsia="fr-FR"/>
-        </w:rPr>
-        <w:t>n……………</w:t>
-      </w:r>
-      <w:proofErr w:type="gramStart"/>
-      <w:r>
-        <w:rPr>
-          <w:rFonts w:ascii="Barlow" w:hAnsi="Barlow"/>
-          <w:lang w:eastAsia="fr-FR"/>
-        </w:rPr>
-        <w:t>…….</w:t>
-      </w:r>
-      <w:proofErr w:type="gramEnd"/>
-      <w:r>
-        <w:rPr>
-          <w:rFonts w:ascii="Barlow" w:hAnsi="Barlow"/>
-          <w:lang w:eastAsia="fr-FR"/>
-        </w:rPr>
-        <w:t>operai</w:t>
-      </w:r>
-    </w:p>
-    <w:p>
-      <w:pPr>
-        <w:ind w:firstLine="3544"/>
-        <w:rPr>
-          <w:rFonts w:ascii="Barlow" w:hAnsi="Barlow"/>
-          <w:lang w:eastAsia="fr-FR"/>
-        </w:rPr>
-      </w:pPr>
-      <w:r>
-        <w:rPr>
-          <w:rFonts w:ascii="Barlow" w:hAnsi="Barlow"/>
-          <w:lang w:eastAsia="fr-FR"/>
-        </w:rPr>
-        <w:t>n……………</w:t>
-      </w:r>
-      <w:proofErr w:type="gramStart"/>
-      <w:r>
-        <w:rPr>
-          <w:rFonts w:ascii="Barlow" w:hAnsi="Barlow"/>
-          <w:lang w:eastAsia="fr-FR"/>
-        </w:rPr>
-        <w:t>…….</w:t>
-      </w:r>
-      <w:proofErr w:type="gramEnd"/>
-      <w:r>
-        <w:rPr>
-          <w:rFonts w:ascii="Barlow" w:hAnsi="Barlow"/>
-          <w:lang w:eastAsia="fr-FR"/>
-        </w:rPr>
-        <w:t>(</w:t>
-      </w:r>
-      <w:proofErr w:type="gramStart"/>
-      <w:r>
-        <w:rPr>
-          <w:rFonts w:ascii="Barlow" w:hAnsi="Barlow"/>
-          <w:lang w:eastAsia="fr-FR"/>
-        </w:rPr>
-        <w:t>altro:…</w:t>
-      </w:r>
-      <w:proofErr w:type="gramEnd"/>
-      <w:r>
-        <w:rPr>
-          <w:rFonts w:ascii="Barlow" w:hAnsi="Barlow"/>
-          <w:lang w:eastAsia="fr-FR"/>
-        </w:rPr>
-        <w:t>…………………)</w:t>
+        <w:t>(altro:……………………)</w:t>
       </w:r>
     </w:p>
     <w:p>
@@ -1224,6 +1176,13 @@
         </w:rPr>
         <w:t>- di essere in regola con il versamento degli oneri contributivi e assicurativi (Inail, Inps e Cassa Edile)</w:t>
       </w:r>
+      <w:r>
+        <w:rPr>
+          <w:rFonts w:ascii="Barlow" w:hAnsi="Barlow"/>
+          <w:lang w:eastAsia="fr-FR"/>
+        </w:rPr>
+        <w:t xml:space="preserve"> (DURC da allegare)</w:t>
+      </w:r>
     </w:p>
     <w:p>
       <w:pPr>
@@ -1250,15 +1209,8 @@
     </w:p>
     <w:p>
       <w:pPr>
-        <w:rPr>
-          <w:rFonts w:ascii="Barlow" w:hAnsi="Barlow"/>
-          <w:lang w:eastAsia="fr-FR"/>
-        </w:rPr>
-      </w:pPr>
-    </w:p>
-    <w:p>
-      <w:pPr>
         <w:spacing w:line="360" w:lineRule="auto"/>
+        <w:ind w:left="708"/>
         <w:rPr>
           <w:rFonts w:ascii="Barlow" w:hAnsi="Barlow"/>
           <w:lang w:eastAsia="fr-FR"/>
@@ -1282,6 +1234,7 @@
     <w:p>
       <w:pPr>
         <w:spacing w:line="360" w:lineRule="auto"/>
+        <w:ind w:left="708"/>
         <w:rPr>
           <w:rFonts w:ascii="Barlow" w:hAnsi="Barlow"/>
           <w:lang w:eastAsia="fr-FR"/>
@@ -1305,6 +1258,7 @@
     <w:p>
       <w:pPr>
         <w:spacing w:line="360" w:lineRule="auto"/>
+        <w:ind w:left="708"/>
         <w:rPr>
           <w:rFonts w:ascii="Barlow" w:hAnsi="Barlow"/>
           <w:lang w:eastAsia="fr-FR"/>
@@ -1328,6 +1282,7 @@
     <w:p>
       <w:pPr>
         <w:spacing w:line="360" w:lineRule="auto"/>
+        <w:ind w:left="708"/>
         <w:rPr>
           <w:rFonts w:ascii="Barlow" w:hAnsi="Barlow"/>
           <w:lang w:eastAsia="fr-FR"/>
@@ -1351,6 +1306,7 @@
     <w:p>
       <w:pPr>
         <w:spacing w:line="360" w:lineRule="auto"/>
+        <w:ind w:left="708"/>
         <w:rPr>
           <w:rFonts w:ascii="Barlow" w:hAnsi="Barlow"/>
           <w:lang w:eastAsia="fr-FR"/>
@@ -1376,6 +1332,38 @@
           <w:lang w:eastAsia="fr-FR"/>
         </w:rPr>
         <w:t>……………………….</w:t>
+      </w:r>
+    </w:p>
+    <w:p>
+      <w:pPr>
+        <w:spacing w:after="240"/>
+        <w:rPr>
+          <w:rFonts w:ascii="Barlow" w:hAnsi="Barlow"/>
+          <w:lang w:eastAsia="fr-FR"/>
+        </w:rPr>
+      </w:pPr>
+    </w:p>
+    <w:p>
+      <w:pPr>
+        <w:spacing w:after="240"/>
+        <w:rPr>
+          <w:rFonts w:ascii="Barlow" w:hAnsi="Barlow"/>
+          <w:lang w:eastAsia="fr-FR"/>
+        </w:rPr>
+      </w:pPr>
+      <w:r>
+        <w:rPr>
+          <w:rFonts w:ascii="Barlow" w:hAnsi="Barlow"/>
+          <w:lang w:eastAsia="fr-FR"/>
+        </w:rPr>
+        <w:t xml:space="preserve">- di </w:t>
+      </w:r>
+      <w:r>
+        <w:rPr>
+          <w:rFonts w:ascii="Barlow" w:hAnsi="Barlow"/>
+          <w:lang w:eastAsia="fr-FR"/>
+        </w:rPr>
+        <w:t>aver consultato il Rappresentante dei Lavoratori (RLS/RLST)</w:t>
       </w:r>
     </w:p>
     <w:p>
@@ -1740,7 +1728,7 @@
 </file>
 
 <file path=word/endnotes.xml><?xml version="1.0" encoding="utf-8"?>
-<w:endnotes xmlns:wpc="http://schemas.microsoft.com/office/word/2010/wordprocessingCanvas" xmlns:cx="http://schemas.microsoft.com/office/drawing/2014/chartex" xmlns:cx1="http://schemas.microsoft.com/office/drawing/2015/9/8/chartex" xmlns:cx2="http://schemas.microsoft.com/office/drawing/2015/10/21/chartex" xmlns:cx3="http://schemas.microsoft.com/office/drawing/2016/5/9/chartex" xmlns:cx4="http://schemas.microsoft.com/office/drawing/2016/5/10/chartex" xmlns:cx5="http://schemas.microsoft.com/office/drawing/2016/5/11/chartex" xmlns:cx6="http://schemas.microsoft.com/office/drawing/2016/5/12/chartex" xmlns:cx7="http://schemas.microsoft.com/office/drawing/2016/5/13/chartex" xmlns:cx8="http://schemas.microsoft.com/office/drawing/2016/5/14/chartex" xmlns:mc="http://schemas.openxmlformats.org/markup-compatibility/2006" xmlns:aink="http://schemas.microsoft.com/office/drawing/2016/ink" xmlns:am3d="http://schemas.microsoft.com/office/drawing/2017/model3d" xmlns:o="urn:schemas-microsoft-com:office:office" xmlns:oel="http://schemas.microsoft.com/office/2019/extlst" xmlns:r="http://schemas.openxmlformats.org/officeDocument/2006/relationships" xmlns:m="http://schemas.openxmlformats.org/officeDocument/2006/math" xmlns:v="urn:schemas-microsoft-com:vml" xmlns:wp14="http://schemas.microsoft.com/office/word/2010/wordprocessingDrawing" xmlns:wp="http://schemas.openxmlformats.org/drawingml/2006/wordprocessingDrawing" xmlns:w10="urn:schemas-microsoft-com:office:word" xmlns:w="http://schemas.openxmlformats.org/wordprocessingml/2006/main" xmlns:w14="http://schemas.microsoft.com/office/word/2010/wordml" xmlns:w15="http://schemas.microsoft.com/office/word/2012/wordml" xmlns:w16cex="http://schemas.microsoft.com/office/word/2018/wordml/cex" xmlns:w16cid="http://schemas.microsoft.com/office/word/2016/wordml/cid" xmlns:w16="http://schemas.microsoft.com/office/word/2018/wordml" xmlns:w16du="http://schemas.microsoft.com/office/word/2023/wordml/word16du" xmlns:w16sdtdh="http://schemas.microsoft.com/office/word/2020/wordml/sdtdatahash" xmlns:w16sdtfl="http://schemas.microsoft.com/office/word/2024/wordml/sdtformatlock" xmlns:w16se="http://schemas.microsoft.com/office/word/2015/wordml/symex" xmlns:wpg="http://schemas.microsoft.com/office/word/2010/wordprocessingGroup" xmlns:wpi="http://schemas.microsoft.com/office/word/2010/wordprocessingInk" xmlns:wne="http://schemas.microsoft.com/office/word/2006/wordml" xmlns:wps="http://schemas.microsoft.com/office/word/2010/wordprocessingShape" mc:Ignorable="w14 w15 w16se w16cid w16 w16cex w16sdtdh w16sdtfl w16du wp14">
+<w:endnotes xmlns:wpc="http://schemas.microsoft.com/office/word/2010/wordprocessingCanvas" xmlns:cx="http://schemas.microsoft.com/office/drawing/2014/chartex" xmlns:cx1="http://schemas.microsoft.com/office/drawing/2015/9/8/chartex" xmlns:cx2="http://schemas.microsoft.com/office/drawing/2015/10/21/chartex" xmlns:cx3="http://schemas.microsoft.com/office/drawing/2016/5/9/chartex" xmlns:cx4="http://schemas.microsoft.com/office/drawing/2016/5/10/chartex" xmlns:cx5="http://schemas.microsoft.com/office/drawing/2016/5/11/chartex" xmlns:cx6="http://schemas.microsoft.com/office/drawing/2016/5/12/chartex" xmlns:cx7="http://schemas.microsoft.com/office/drawing/2016/5/13/chartex" xmlns:cx8="http://schemas.microsoft.com/office/drawing/2016/5/14/chartex" xmlns:mc="http://schemas.openxmlformats.org/markup-compatibility/2006" xmlns:aink="http://schemas.microsoft.com/office/drawing/2016/ink" xmlns:am3d="http://schemas.microsoft.com/office/drawing/2017/model3d" xmlns:o="urn:schemas-microsoft-com:office:office" xmlns:oel="http://schemas.microsoft.com/office/2019/extlst" xmlns:r="http://schemas.openxmlformats.org/officeDocument/2006/relationships" xmlns:m="http://schemas.openxmlformats.org/officeDocument/2006/math" xmlns:v="urn:schemas-microsoft-com:vml" xmlns:wp14="http://schemas.microsoft.com/office/word/2010/wordprocessingDrawing" xmlns:wp="http://schemas.openxmlformats.org/drawingml/2006/wordprocessingDrawing" xmlns:w10="urn:schemas-microsoft-com:office:word" xmlns:w="http://schemas.openxmlformats.org/wordprocessingml/2006/main" xmlns:w14="http://schemas.microsoft.com/office/word/2010/wordml" xmlns:w15="http://schemas.microsoft.com/office/word/2012/wordml" xmlns:w16cex="http://schemas.microsoft.com/office/word/2018/wordml/cex" xmlns:w16cid="http://schemas.microsoft.com/office/word/2016/wordml/cid" xmlns:w16="http://schemas.microsoft.com/office/word/2018/wordml" xmlns:w16sdtdh="http://schemas.microsoft.com/office/word/2020/wordml/sdtdatahash" xmlns:w16se="http://schemas.microsoft.com/office/word/2015/wordml/symex" xmlns:wpg="http://schemas.microsoft.com/office/word/2010/wordprocessingGroup" xmlns:wpi="http://schemas.microsoft.com/office/word/2010/wordprocessingInk" xmlns:wne="http://schemas.microsoft.com/office/word/2006/wordml" xmlns:wps="http://schemas.microsoft.com/office/word/2010/wordprocessingShape" mc:Ignorable="w14 w15 w16se w16cid w16 w16cex w16sdtdh wp14">
   <w:endnote w:type="separator" w:id="-1">
     <w:p>
       <w:pPr>
@@ -1765,7 +1753,7 @@
 </file>
 
 <file path=word/footer1.xml><?xml version="1.0" encoding="utf-8"?>
-<w:ftr xmlns:wpc="http://schemas.microsoft.com/office/word/2010/wordprocessingCanvas" xmlns:cx="http://schemas.microsoft.com/office/drawing/2014/chartex" xmlns:cx1="http://schemas.microsoft.com/office/drawing/2015/9/8/chartex" xmlns:cx2="http://schemas.microsoft.com/office/drawing/2015/10/21/chartex" xmlns:cx3="http://schemas.microsoft.com/office/drawing/2016/5/9/chartex" xmlns:cx4="http://schemas.microsoft.com/office/drawing/2016/5/10/chartex" xmlns:cx5="http://schemas.microsoft.com/office/drawing/2016/5/11/chartex" xmlns:cx6="http://schemas.microsoft.com/office/drawing/2016/5/12/chartex" xmlns:cx7="http://schemas.microsoft.com/office/drawing/2016/5/13/chartex" xmlns:cx8="http://schemas.microsoft.com/office/drawing/2016/5/14/chartex" xmlns:mc="http://schemas.openxmlformats.org/markup-compatibility/2006" xmlns:aink="http://schemas.microsoft.com/office/drawing/2016/ink" xmlns:am3d="http://schemas.microsoft.com/office/drawing/2017/model3d" xmlns:o="urn:schemas-microsoft-com:office:office" xmlns:oel="http://schemas.microsoft.com/office/2019/extlst" xmlns:r="http://schemas.openxmlformats.org/officeDocument/2006/relationships" xmlns:m="http://schemas.openxmlformats.org/officeDocument/2006/math" xmlns:v="urn:schemas-microsoft-com:vml" xmlns:wp14="http://schemas.microsoft.com/office/word/2010/wordprocessingDrawing" xmlns:wp="http://schemas.openxmlformats.org/drawingml/2006/wordprocessingDrawing" xmlns:w10="urn:schemas-microsoft-com:office:word" xmlns:w="http://schemas.openxmlformats.org/wordprocessingml/2006/main" xmlns:w14="http://schemas.microsoft.com/office/word/2010/wordml" xmlns:w15="http://schemas.microsoft.com/office/word/2012/wordml" xmlns:w16cex="http://schemas.microsoft.com/office/word/2018/wordml/cex" xmlns:w16cid="http://schemas.microsoft.com/office/word/2016/wordml/cid" xmlns:w16="http://schemas.microsoft.com/office/word/2018/wordml" xmlns:w16du="http://schemas.microsoft.com/office/word/2023/wordml/word16du" xmlns:w16sdtdh="http://schemas.microsoft.com/office/word/2020/wordml/sdtdatahash" xmlns:w16sdtfl="http://schemas.microsoft.com/office/word/2024/wordml/sdtformatlock" xmlns:w16se="http://schemas.microsoft.com/office/word/2015/wordml/symex" xmlns:wpg="http://schemas.microsoft.com/office/word/2010/wordprocessingGroup" xmlns:wpi="http://schemas.microsoft.com/office/word/2010/wordprocessingInk" xmlns:wne="http://schemas.microsoft.com/office/word/2006/wordml" xmlns:wps="http://schemas.microsoft.com/office/word/2010/wordprocessingShape" mc:Ignorable="w14 w15 w16se w16cid w16 w16cex w16sdtdh w16sdtfl w16du wp14">
+<w:ftr xmlns:wpc="http://schemas.microsoft.com/office/word/2010/wordprocessingCanvas" xmlns:cx="http://schemas.microsoft.com/office/drawing/2014/chartex" xmlns:cx1="http://schemas.microsoft.com/office/drawing/2015/9/8/chartex" xmlns:cx2="http://schemas.microsoft.com/office/drawing/2015/10/21/chartex" xmlns:cx3="http://schemas.microsoft.com/office/drawing/2016/5/9/chartex" xmlns:cx4="http://schemas.microsoft.com/office/drawing/2016/5/10/chartex" xmlns:cx5="http://schemas.microsoft.com/office/drawing/2016/5/11/chartex" xmlns:cx6="http://schemas.microsoft.com/office/drawing/2016/5/12/chartex" xmlns:cx7="http://schemas.microsoft.com/office/drawing/2016/5/13/chartex" xmlns:cx8="http://schemas.microsoft.com/office/drawing/2016/5/14/chartex" xmlns:mc="http://schemas.openxmlformats.org/markup-compatibility/2006" xmlns:aink="http://schemas.microsoft.com/office/drawing/2016/ink" xmlns:am3d="http://schemas.microsoft.com/office/drawing/2017/model3d" xmlns:o="urn:schemas-microsoft-com:office:office" xmlns:oel="http://schemas.microsoft.com/office/2019/extlst" xmlns:r="http://schemas.openxmlformats.org/officeDocument/2006/relationships" xmlns:m="http://schemas.openxmlformats.org/officeDocument/2006/math" xmlns:v="urn:schemas-microsoft-com:vml" xmlns:wp14="http://schemas.microsoft.com/office/word/2010/wordprocessingDrawing" xmlns:wp="http://schemas.openxmlformats.org/drawingml/2006/wordprocessingDrawing" xmlns:w10="urn:schemas-microsoft-com:office:word" xmlns:w="http://schemas.openxmlformats.org/wordprocessingml/2006/main" xmlns:w14="http://schemas.microsoft.com/office/word/2010/wordml" xmlns:w15="http://schemas.microsoft.com/office/word/2012/wordml" xmlns:w16cex="http://schemas.microsoft.com/office/word/2018/wordml/cex" xmlns:w16cid="http://schemas.microsoft.com/office/word/2016/wordml/cid" xmlns:w16="http://schemas.microsoft.com/office/word/2018/wordml" xmlns:w16sdtdh="http://schemas.microsoft.com/office/word/2020/wordml/sdtdatahash" xmlns:w16se="http://schemas.microsoft.com/office/word/2015/wordml/symex" xmlns:wpg="http://schemas.microsoft.com/office/word/2010/wordprocessingGroup" xmlns:wpi="http://schemas.microsoft.com/office/word/2010/wordprocessingInk" xmlns:wne="http://schemas.microsoft.com/office/word/2006/wordml" xmlns:wps="http://schemas.microsoft.com/office/word/2010/wordprocessingShape" mc:Ignorable="w14 w15 w16se w16cid w16 w16cex w16sdtdh wp14">
   <w:p>
     <w:pPr>
       <w:pStyle w:val="Pidipagina"/>
@@ -1955,7 +1943,7 @@
 </file>
 
 <file path=word/footnotes.xml><?xml version="1.0" encoding="utf-8"?>
-<w:footnotes xmlns:wpc="http://schemas.microsoft.com/office/word/2010/wordprocessingCanvas" xmlns:cx="http://schemas.microsoft.com/office/drawing/2014/chartex" xmlns:cx1="http://schemas.microsoft.com/office/drawing/2015/9/8/chartex" xmlns:cx2="http://schemas.microsoft.com/office/drawing/2015/10/21/chartex" xmlns:cx3="http://schemas.microsoft.com/office/drawing/2016/5/9/chartex" xmlns:cx4="http://schemas.microsoft.com/office/drawing/2016/5/10/chartex" xmlns:cx5="http://schemas.microsoft.com/office/drawing/2016/5/11/chartex" xmlns:cx6="http://schemas.microsoft.com/office/drawing/2016/5/12/chartex" xmlns:cx7="http://schemas.microsoft.com/office/drawing/2016/5/13/chartex" xmlns:cx8="http://schemas.microsoft.com/office/drawing/2016/5/14/chartex" xmlns:mc="http://schemas.openxmlformats.org/markup-compatibility/2006" xmlns:aink="http://schemas.microsoft.com/office/drawing/2016/ink" xmlns:am3d="http://schemas.microsoft.com/office/drawing/2017/model3d" xmlns:o="urn:schemas-microsoft-com:office:office" xmlns:oel="http://schemas.microsoft.com/office/2019/extlst" xmlns:r="http://schemas.openxmlformats.org/officeDocument/2006/relationships" xmlns:m="http://schemas.openxmlformats.org/officeDocument/2006/math" xmlns:v="urn:schemas-microsoft-com:vml" xmlns:wp14="http://schemas.microsoft.com/office/word/2010/wordprocessingDrawing" xmlns:wp="http://schemas.openxmlformats.org/drawingml/2006/wordprocessingDrawing" xmlns:w10="urn:schemas-microsoft-com:office:word" xmlns:w="http://schemas.openxmlformats.org/wordprocessingml/2006/main" xmlns:w14="http://schemas.microsoft.com/office/word/2010/wordml" xmlns:w15="http://schemas.microsoft.com/office/word/2012/wordml" xmlns:w16cex="http://schemas.microsoft.com/office/word/2018/wordml/cex" xmlns:w16cid="http://schemas.microsoft.com/office/word/2016/wordml/cid" xmlns:w16="http://schemas.microsoft.com/office/word/2018/wordml" xmlns:w16du="http://schemas.microsoft.com/office/word/2023/wordml/word16du" xmlns:w16sdtdh="http://schemas.microsoft.com/office/word/2020/wordml/sdtdatahash" xmlns:w16sdtfl="http://schemas.microsoft.com/office/word/2024/wordml/sdtformatlock" xmlns:w16se="http://schemas.microsoft.com/office/word/2015/wordml/symex" xmlns:wpg="http://schemas.microsoft.com/office/word/2010/wordprocessingGroup" xmlns:wpi="http://schemas.microsoft.com/office/word/2010/wordprocessingInk" xmlns:wne="http://schemas.microsoft.com/office/word/2006/wordml" xmlns:wps="http://schemas.microsoft.com/office/word/2010/wordprocessingShape" mc:Ignorable="w14 w15 w16se w16cid w16 w16cex w16sdtdh w16sdtfl w16du wp14">
+<w:footnotes xmlns:wpc="http://schemas.microsoft.com/office/word/2010/wordprocessingCanvas" xmlns:cx="http://schemas.microsoft.com/office/drawing/2014/chartex" xmlns:cx1="http://schemas.microsoft.com/office/drawing/2015/9/8/chartex" xmlns:cx2="http://schemas.microsoft.com/office/drawing/2015/10/21/chartex" xmlns:cx3="http://schemas.microsoft.com/office/drawing/2016/5/9/chartex" xmlns:cx4="http://schemas.microsoft.com/office/drawing/2016/5/10/chartex" xmlns:cx5="http://schemas.microsoft.com/office/drawing/2016/5/11/chartex" xmlns:cx6="http://schemas.microsoft.com/office/drawing/2016/5/12/chartex" xmlns:cx7="http://schemas.microsoft.com/office/drawing/2016/5/13/chartex" xmlns:cx8="http://schemas.microsoft.com/office/drawing/2016/5/14/chartex" xmlns:mc="http://schemas.openxmlformats.org/markup-compatibility/2006" xmlns:aink="http://schemas.microsoft.com/office/drawing/2016/ink" xmlns:am3d="http://schemas.microsoft.com/office/drawing/2017/model3d" xmlns:o="urn:schemas-microsoft-com:office:office" xmlns:oel="http://schemas.microsoft.com/office/2019/extlst" xmlns:r="http://schemas.openxmlformats.org/officeDocument/2006/relationships" xmlns:m="http://schemas.openxmlformats.org/officeDocument/2006/math" xmlns:v="urn:schemas-microsoft-com:vml" xmlns:wp14="http://schemas.microsoft.com/office/word/2010/wordprocessingDrawing" xmlns:wp="http://schemas.openxmlformats.org/drawingml/2006/wordprocessingDrawing" xmlns:w10="urn:schemas-microsoft-com:office:word" xmlns:w="http://schemas.openxmlformats.org/wordprocessingml/2006/main" xmlns:w14="http://schemas.microsoft.com/office/word/2010/wordml" xmlns:w15="http://schemas.microsoft.com/office/word/2012/wordml" xmlns:w16cex="http://schemas.microsoft.com/office/word/2018/wordml/cex" xmlns:w16cid="http://schemas.microsoft.com/office/word/2016/wordml/cid" xmlns:w16="http://schemas.microsoft.com/office/word/2018/wordml" xmlns:w16sdtdh="http://schemas.microsoft.com/office/word/2020/wordml/sdtdatahash" xmlns:w16se="http://schemas.microsoft.com/office/word/2015/wordml/symex" xmlns:wpg="http://schemas.microsoft.com/office/word/2010/wordprocessingGroup" xmlns:wpi="http://schemas.microsoft.com/office/word/2010/wordprocessingInk" xmlns:wne="http://schemas.microsoft.com/office/word/2006/wordml" xmlns:wps="http://schemas.microsoft.com/office/word/2010/wordprocessingShape" mc:Ignorable="w14 w15 w16se w16cid w16 w16cex w16sdtdh wp14">
   <w:footnote w:type="separator" w:id="-1">
     <w:p>
       <w:pPr>
@@ -1980,7 +1968,7 @@
 </file>
 
 <file path=word/header1.xml><?xml version="1.0" encoding="utf-8"?>
-<w:hdr xmlns:wpc="http://schemas.microsoft.com/office/word/2010/wordprocessingCanvas" xmlns:cx="http://schemas.microsoft.com/office/drawing/2014/chartex" xmlns:cx1="http://schemas.microsoft.com/office/drawing/2015/9/8/chartex" xmlns:cx2="http://schemas.microsoft.com/office/drawing/2015/10/21/chartex" xmlns:cx3="http://schemas.microsoft.com/office/drawing/2016/5/9/chartex" xmlns:cx4="http://schemas.microsoft.com/office/drawing/2016/5/10/chartex" xmlns:cx5="http://schemas.microsoft.com/office/drawing/2016/5/11/chartex" xmlns:cx6="http://schemas.microsoft.com/office/drawing/2016/5/12/chartex" xmlns:cx7="http://schemas.microsoft.com/office/drawing/2016/5/13/chartex" xmlns:cx8="http://schemas.microsoft.com/office/drawing/2016/5/14/chartex" xmlns:mc="http://schemas.openxmlformats.org/markup-compatibility/2006" xmlns:aink="http://schemas.microsoft.com/office/drawing/2016/ink" xmlns:am3d="http://schemas.microsoft.com/office/drawing/2017/model3d" xmlns:o="urn:schemas-microsoft-com:office:office" xmlns:oel="http://schemas.microsoft.com/office/2019/extlst" xmlns:r="http://schemas.openxmlformats.org/officeDocument/2006/relationships" xmlns:m="http://schemas.openxmlformats.org/officeDocument/2006/math" xmlns:v="urn:schemas-microsoft-com:vml" xmlns:wp14="http://schemas.microsoft.com/office/word/2010/wordprocessingDrawing" xmlns:wp="http://schemas.openxmlformats.org/drawingml/2006/wordprocessingDrawing" xmlns:w10="urn:schemas-microsoft-com:office:word" xmlns:w="http://schemas.openxmlformats.org/wordprocessingml/2006/main" xmlns:w14="http://schemas.microsoft.com/office/word/2010/wordml" xmlns:w15="http://schemas.microsoft.com/office/word/2012/wordml" xmlns:w16cex="http://schemas.microsoft.com/office/word/2018/wordml/cex" xmlns:w16cid="http://schemas.microsoft.com/office/word/2016/wordml/cid" xmlns:w16="http://schemas.microsoft.com/office/word/2018/wordml" xmlns:w16du="http://schemas.microsoft.com/office/word/2023/wordml/word16du" xmlns:w16sdtdh="http://schemas.microsoft.com/office/word/2020/wordml/sdtdatahash" xmlns:w16sdtfl="http://schemas.microsoft.com/office/word/2024/wordml/sdtformatlock" xmlns:w16se="http://schemas.microsoft.com/office/word/2015/wordml/symex" xmlns:wpg="http://schemas.microsoft.com/office/word/2010/wordprocessingGroup" xmlns:wpi="http://schemas.microsoft.com/office/word/2010/wordprocessingInk" xmlns:wne="http://schemas.microsoft.com/office/word/2006/wordml" xmlns:wps="http://schemas.microsoft.com/office/word/2010/wordprocessingShape" mc:Ignorable="w14 w15 w16se w16cid w16 w16cex w16sdtdh w16sdtfl w16du wp14">
+<w:hdr xmlns:wpc="http://schemas.microsoft.com/office/word/2010/wordprocessingCanvas" xmlns:cx="http://schemas.microsoft.com/office/drawing/2014/chartex" xmlns:cx1="http://schemas.microsoft.com/office/drawing/2015/9/8/chartex" xmlns:cx2="http://schemas.microsoft.com/office/drawing/2015/10/21/chartex" xmlns:cx3="http://schemas.microsoft.com/office/drawing/2016/5/9/chartex" xmlns:cx4="http://schemas.microsoft.com/office/drawing/2016/5/10/chartex" xmlns:cx5="http://schemas.microsoft.com/office/drawing/2016/5/11/chartex" xmlns:cx6="http://schemas.microsoft.com/office/drawing/2016/5/12/chartex" xmlns:cx7="http://schemas.microsoft.com/office/drawing/2016/5/13/chartex" xmlns:cx8="http://schemas.microsoft.com/office/drawing/2016/5/14/chartex" xmlns:mc="http://schemas.openxmlformats.org/markup-compatibility/2006" xmlns:aink="http://schemas.microsoft.com/office/drawing/2016/ink" xmlns:am3d="http://schemas.microsoft.com/office/drawing/2017/model3d" xmlns:o="urn:schemas-microsoft-com:office:office" xmlns:oel="http://schemas.microsoft.com/office/2019/extlst" xmlns:r="http://schemas.openxmlformats.org/officeDocument/2006/relationships" xmlns:m="http://schemas.openxmlformats.org/officeDocument/2006/math" xmlns:v="urn:schemas-microsoft-com:vml" xmlns:wp14="http://schemas.microsoft.com/office/word/2010/wordprocessingDrawing" xmlns:wp="http://schemas.openxmlformats.org/drawingml/2006/wordprocessingDrawing" xmlns:w10="urn:schemas-microsoft-com:office:word" xmlns:w="http://schemas.openxmlformats.org/wordprocessingml/2006/main" xmlns:w14="http://schemas.microsoft.com/office/word/2010/wordml" xmlns:w15="http://schemas.microsoft.com/office/word/2012/wordml" xmlns:w16cex="http://schemas.microsoft.com/office/word/2018/wordml/cex" xmlns:w16cid="http://schemas.microsoft.com/office/word/2016/wordml/cid" xmlns:w16="http://schemas.microsoft.com/office/word/2018/wordml" xmlns:w16sdtdh="http://schemas.microsoft.com/office/word/2020/wordml/sdtdatahash" xmlns:w16se="http://schemas.microsoft.com/office/word/2015/wordml/symex" xmlns:wpg="http://schemas.microsoft.com/office/word/2010/wordprocessingGroup" xmlns:wpi="http://schemas.microsoft.com/office/word/2010/wordprocessingInk" xmlns:wne="http://schemas.microsoft.com/office/word/2006/wordml" xmlns:wps="http://schemas.microsoft.com/office/word/2010/wordprocessingShape" mc:Ignorable="w14 w15 w16se w16cid w16 w16cex w16sdtdh wp14">
   <w:tbl>
     <w:tblPr>
       <w:tblW w:w="10009" w:type="dxa"/>
@@ -2295,7 +2283,7 @@
 </file>
 
 <file path=word/numbering.xml><?xml version="1.0" encoding="utf-8"?>
-<w:numbering xmlns:wpc="http://schemas.microsoft.com/office/word/2010/wordprocessingCanvas" xmlns:cx="http://schemas.microsoft.com/office/drawing/2014/chartex" xmlns:cx1="http://schemas.microsoft.com/office/drawing/2015/9/8/chartex" xmlns:cx2="http://schemas.microsoft.com/office/drawing/2015/10/21/chartex" xmlns:cx3="http://schemas.microsoft.com/office/drawing/2016/5/9/chartex" xmlns:cx4="http://schemas.microsoft.com/office/drawing/2016/5/10/chartex" xmlns:cx5="http://schemas.microsoft.com/office/drawing/2016/5/11/chartex" xmlns:cx6="http://schemas.microsoft.com/office/drawing/2016/5/12/chartex" xmlns:cx7="http://schemas.microsoft.com/office/drawing/2016/5/13/chartex" xmlns:cx8="http://schemas.microsoft.com/office/drawing/2016/5/14/chartex" xmlns:mc="http://schemas.openxmlformats.org/markup-compatibility/2006" xmlns:aink="http://schemas.microsoft.com/office/drawing/2016/ink" xmlns:am3d="http://schemas.microsoft.com/office/drawing/2017/model3d" xmlns:o="urn:schemas-microsoft-com:office:office" xmlns:oel="http://schemas.microsoft.com/office/2019/extlst" xmlns:r="http://schemas.openxmlformats.org/officeDocument/2006/relationships" xmlns:m="http://schemas.openxmlformats.org/officeDocument/2006/math" xmlns:v="urn:schemas-microsoft-com:vml" xmlns:wp14="http://schemas.microsoft.com/office/word/2010/wordprocessingDrawing" xmlns:wp="http://schemas.openxmlformats.org/drawingml/2006/wordprocessingDrawing" xmlns:w10="urn:schemas-microsoft-com:office:word" xmlns:w="http://schemas.openxmlformats.org/wordprocessingml/2006/main" xmlns:w14="http://schemas.microsoft.com/office/word/2010/wordml" xmlns:w15="http://schemas.microsoft.com/office/word/2012/wordml" xmlns:w16cex="http://schemas.microsoft.com/office/word/2018/wordml/cex" xmlns:w16cid="http://schemas.microsoft.com/office/word/2016/wordml/cid" xmlns:w16="http://schemas.microsoft.com/office/word/2018/wordml" xmlns:w16du="http://schemas.microsoft.com/office/word/2023/wordml/word16du" xmlns:w16sdtdh="http://schemas.microsoft.com/office/word/2020/wordml/sdtdatahash" xmlns:w16sdtfl="http://schemas.microsoft.com/office/word/2024/wordml/sdtformatlock" xmlns:w16se="http://schemas.microsoft.com/office/word/2015/wordml/symex" xmlns:wpg="http://schemas.microsoft.com/office/word/2010/wordprocessingGroup" xmlns:wpi="http://schemas.microsoft.com/office/word/2010/wordprocessingInk" xmlns:wne="http://schemas.microsoft.com/office/word/2006/wordml" xmlns:wps="http://schemas.microsoft.com/office/word/2010/wordprocessingShape" mc:Ignorable="w14 w15 w16se w16cid w16 w16cex w16sdtdh w16sdtfl w16du wp14">
+<w:numbering xmlns:wpc="http://schemas.microsoft.com/office/word/2010/wordprocessingCanvas" xmlns:cx="http://schemas.microsoft.com/office/drawing/2014/chartex" xmlns:cx1="http://schemas.microsoft.com/office/drawing/2015/9/8/chartex" xmlns:cx2="http://schemas.microsoft.com/office/drawing/2015/10/21/chartex" xmlns:cx3="http://schemas.microsoft.com/office/drawing/2016/5/9/chartex" xmlns:cx4="http://schemas.microsoft.com/office/drawing/2016/5/10/chartex" xmlns:cx5="http://schemas.microsoft.com/office/drawing/2016/5/11/chartex" xmlns:cx6="http://schemas.microsoft.com/office/drawing/2016/5/12/chartex" xmlns:cx7="http://schemas.microsoft.com/office/drawing/2016/5/13/chartex" xmlns:cx8="http://schemas.microsoft.com/office/drawing/2016/5/14/chartex" xmlns:mc="http://schemas.openxmlformats.org/markup-compatibility/2006" xmlns:aink="http://schemas.microsoft.com/office/drawing/2016/ink" xmlns:am3d="http://schemas.microsoft.com/office/drawing/2017/model3d" xmlns:o="urn:schemas-microsoft-com:office:office" xmlns:oel="http://schemas.microsoft.com/office/2019/extlst" xmlns:r="http://schemas.openxmlformats.org/officeDocument/2006/relationships" xmlns:m="http://schemas.openxmlformats.org/officeDocument/2006/math" xmlns:v="urn:schemas-microsoft-com:vml" xmlns:wp14="http://schemas.microsoft.com/office/word/2010/wordprocessingDrawing" xmlns:wp="http://schemas.openxmlformats.org/drawingml/2006/wordprocessingDrawing" xmlns:w10="urn:schemas-microsoft-com:office:word" xmlns:w="http://schemas.openxmlformats.org/wordprocessingml/2006/main" xmlns:w14="http://schemas.microsoft.com/office/word/2010/wordml" xmlns:w15="http://schemas.microsoft.com/office/word/2012/wordml" xmlns:w16cex="http://schemas.microsoft.com/office/word/2018/wordml/cex" xmlns:w16cid="http://schemas.microsoft.com/office/word/2016/wordml/cid" xmlns:w16="http://schemas.microsoft.com/office/word/2018/wordml" xmlns:w16sdtdh="http://schemas.microsoft.com/office/word/2020/wordml/sdtdatahash" xmlns:w16se="http://schemas.microsoft.com/office/word/2015/wordml/symex" xmlns:wpg="http://schemas.microsoft.com/office/word/2010/wordprocessingGroup" xmlns:wpi="http://schemas.microsoft.com/office/word/2010/wordprocessingInk" xmlns:wne="http://schemas.microsoft.com/office/word/2006/wordml" xmlns:wps="http://schemas.microsoft.com/office/word/2010/wordprocessingShape" mc:Ignorable="w14 w15 w16se w16cid w16 w16cex w16sdtdh wp14">
   <w:abstractNum w:abstractNumId="0" w15:restartNumberingAfterBreak="0">
     <w:nsid w:val="0D6C0B08"/>
     <w:multiLevelType w:val="hybridMultilevel"/>
@@ -2616,6 +2604,118 @@
       </w:pPr>
     </w:lvl>
   </w:abstractNum>
+  <w:abstractNum w:abstractNumId="3" w15:restartNumberingAfterBreak="0">
+    <w:nsid w:val="36CA1B8E"/>
+    <w:multiLevelType w:val="hybridMultilevel"/>
+    <w:tmpl w:val="1A8CB0AC"/>
+    <w:lvl w:ilvl="0" w:tplc="A7E45E96">
+      <w:numFmt w:val="bullet"/>
+      <w:lvlText w:val="-"/>
+      <w:lvlJc w:val="left"/>
+      <w:pPr>
+        <w:ind w:left="720" w:hanging="360"/>
+      </w:pPr>
+      <w:rPr>
+        <w:rFonts w:ascii="Barlow" w:eastAsia="Calibri" w:hAnsi="Barlow" w:cs="Arial" w:hint="default"/>
+      </w:rPr>
+    </w:lvl>
+    <w:lvl w:ilvl="1" w:tplc="04100003" w:tentative="1">
+      <w:start w:val="1"/>
+      <w:numFmt w:val="bullet"/>
+      <w:lvlText w:val="o"/>
+      <w:lvlJc w:val="left"/>
+      <w:pPr>
+        <w:ind w:left="1440" w:hanging="360"/>
+      </w:pPr>
+      <w:rPr>
+        <w:rFonts w:ascii="Courier New" w:hAnsi="Courier New" w:cs="Courier New" w:hint="default"/>
+      </w:rPr>
+    </w:lvl>
+    <w:lvl w:ilvl="2" w:tplc="04100005" w:tentative="1">
+      <w:start w:val="1"/>
+      <w:numFmt w:val="bullet"/>
+      <w:lvlText w:val=""/>
+      <w:lvlJc w:val="left"/>
+      <w:pPr>
+        <w:ind w:left="2160" w:hanging="360"/>
+      </w:pPr>
+      <w:rPr>
+        <w:rFonts w:ascii="Wingdings" w:hAnsi="Wingdings" w:hint="default"/>
+      </w:rPr>
+    </w:lvl>
+    <w:lvl w:ilvl="3" w:tplc="04100001" w:tentative="1">
+      <w:start w:val="1"/>
+      <w:numFmt w:val="bullet"/>
+      <w:lvlText w:val=""/>
+      <w:lvlJc w:val="left"/>
+      <w:pPr>
+        <w:ind w:left="2880" w:hanging="360"/>
+      </w:pPr>
+      <w:rPr>
+        <w:rFonts w:ascii="Symbol" w:hAnsi="Symbol" w:hint="default"/>
+      </w:rPr>
+    </w:lvl>
+    <w:lvl w:ilvl="4" w:tplc="04100003" w:tentative="1">
+      <w:start w:val="1"/>
+      <w:numFmt w:val="bullet"/>
+      <w:lvlText w:val="o"/>
+      <w:lvlJc w:val="left"/>
+      <w:pPr>
+        <w:ind w:left="3600" w:hanging="360"/>
+      </w:pPr>
+      <w:rPr>
+        <w:rFonts w:ascii="Courier New" w:hAnsi="Courier New" w:cs="Courier New" w:hint="default"/>
+      </w:rPr>
+    </w:lvl>
+    <w:lvl w:ilvl="5" w:tplc="04100005" w:tentative="1">
+      <w:start w:val="1"/>
+      <w:numFmt w:val="bullet"/>
+      <w:lvlText w:val=""/>
+      <w:lvlJc w:val="left"/>
+      <w:pPr>
+        <w:ind w:left="4320" w:hanging="360"/>
+      </w:pPr>
+      <w:rPr>
+        <w:rFonts w:ascii="Wingdings" w:hAnsi="Wingdings" w:hint="default"/>
+      </w:rPr>
+    </w:lvl>
+    <w:lvl w:ilvl="6" w:tplc="04100001" w:tentative="1">
+      <w:start w:val="1"/>
+      <w:numFmt w:val="bullet"/>
+      <w:lvlText w:val=""/>
+      <w:lvlJc w:val="left"/>
+      <w:pPr>
+        <w:ind w:left="5040" w:hanging="360"/>
+      </w:pPr>
+      <w:rPr>
+        <w:rFonts w:ascii="Symbol" w:hAnsi="Symbol" w:hint="default"/>
+      </w:rPr>
+    </w:lvl>
+    <w:lvl w:ilvl="7" w:tplc="04100003" w:tentative="1">
+      <w:start w:val="1"/>
+      <w:numFmt w:val="bullet"/>
+      <w:lvlText w:val="o"/>
+      <w:lvlJc w:val="left"/>
+      <w:pPr>
+        <w:ind w:left="5760" w:hanging="360"/>
+      </w:pPr>
+      <w:rPr>
+        <w:rFonts w:ascii="Courier New" w:hAnsi="Courier New" w:cs="Courier New" w:hint="default"/>
+      </w:rPr>
+    </w:lvl>
+    <w:lvl w:ilvl="8" w:tplc="04100005" w:tentative="1">
+      <w:start w:val="1"/>
+      <w:numFmt w:val="bullet"/>
+      <w:lvlText w:val=""/>
+      <w:lvlJc w:val="left"/>
+      <w:pPr>
+        <w:ind w:left="6480" w:hanging="360"/>
+      </w:pPr>
+      <w:rPr>
+        <w:rFonts w:ascii="Wingdings" w:hAnsi="Wingdings" w:hint="default"/>
+      </w:rPr>
+    </w:lvl>
+  </w:abstractNum>
   <w:num w:numId="1" w16cid:durableId="1011954917">
     <w:abstractNumId w:val="2"/>
   </w:num>
@@ -2625,11 +2725,14 @@
   <w:num w:numId="3" w16cid:durableId="84227652">
     <w:abstractNumId w:val="1"/>
   </w:num>
+  <w:num w:numId="4" w16cid:durableId="2135827443">
+    <w:abstractNumId w:val="3"/>
+  </w:num>
 </w:numbering>
 </file>
 
 <file path=word/styles.xml><?xml version="1.0" encoding="utf-8"?>
-<w:styles xmlns:mc="http://schemas.openxmlformats.org/markup-compatibility/2006" xmlns:r="http://schemas.openxmlformats.org/officeDocument/2006/relationships" xmlns:w="http://schemas.openxmlformats.org/wordprocessingml/2006/main" xmlns:w14="http://schemas.microsoft.com/office/word/2010/wordml" xmlns:w15="http://schemas.microsoft.com/office/word/2012/wordml" xmlns:w16cex="http://schemas.microsoft.com/office/word/2018/wordml/cex" xmlns:w16cid="http://schemas.microsoft.com/office/word/2016/wordml/cid" xmlns:w16="http://schemas.microsoft.com/office/word/2018/wordml" xmlns:w16du="http://schemas.microsoft.com/office/word/2023/wordml/word16du" xmlns:w16sdtdh="http://schemas.microsoft.com/office/word/2020/wordml/sdtdatahash" xmlns:w16sdtfl="http://schemas.microsoft.com/office/word/2024/wordml/sdtformatlock" xmlns:w16se="http://schemas.microsoft.com/office/word/2015/wordml/symex" mc:Ignorable="w14 w15 w16se w16cid w16 w16cex w16sdtdh w16sdtfl w16du">
+<w:styles xmlns:mc="http://schemas.openxmlformats.org/markup-compatibility/2006" xmlns:r="http://schemas.openxmlformats.org/officeDocument/2006/relationships" xmlns:w="http://schemas.openxmlformats.org/wordprocessingml/2006/main" xmlns:w14="http://schemas.microsoft.com/office/word/2010/wordml" xmlns:w15="http://schemas.microsoft.com/office/word/2012/wordml" xmlns:w16cex="http://schemas.microsoft.com/office/word/2018/wordml/cex" xmlns:w16cid="http://schemas.microsoft.com/office/word/2016/wordml/cid" xmlns:w16="http://schemas.microsoft.com/office/word/2018/wordml" xmlns:w16sdtdh="http://schemas.microsoft.com/office/word/2020/wordml/sdtdatahash" xmlns:w16se="http://schemas.microsoft.com/office/word/2015/wordml/symex" mc:Ignorable="w14 w15 w16se w16cid w16 w16cex w16sdtdh">
   <w:docDefaults>
     <w:rPrDefault>
       <w:rPr>

</xml_diff>